<commit_message>
Document live Cloud Run deployment
</commit_message>
<xml_diff>
--- a/docs/Mini-GRP-v34-Complete-Project-Report.docx
+++ b/docs/Mini-GRP-v34-Complete-Project-Report.docx
@@ -182,7 +182,7 @@
                 <w:b w:val="0"/>
                 <w:sz w:val="21"/>
               </w:rPr>
-              <w:t>2026-06-12</w:t>
+              <w:t>2026-06-13</w:t>
             </w:r>
           </w:p>
         </w:tc>
@@ -937,7 +937,7 @@
           <w:color w:val="5B6571"/>
           <w:sz w:val="19"/>
         </w:rPr>
-        <w:t>9.4 当前本机安装状态</w:t>
+        <w:t>9.4 实际生产部署状态</w:t>
       </w:r>
     </w:p>
     <w:p>
@@ -1312,7 +1312,7 @@
           <w:color w:val="16344E"/>
           <w:sz w:val="21"/>
         </w:rPr>
-        <w:t>报告日期：2026-06-12</w:t>
+        <w:t>报告日期：2026-06-13</w:t>
       </w:r>
     </w:p>
     <w:p>
@@ -1360,7 +1360,7 @@
           <w:color w:val="16344E"/>
           <w:sz w:val="21"/>
         </w:rPr>
-        <w:t>重要声明：本项目不是自动交易系统，报告中的短样本结果不构成投资建议或历史业绩陈述</w:t>
+        <w:t>重要声明：本项目不是自动交易系统，报告中的历史验证结果不构成投资建议或历史业绩陈述</w:t>
       </w:r>
     </w:p>
     <w:p>
@@ -1623,7 +1623,7 @@
           <w:rFonts w:ascii="Calibri" w:hAnsi="Calibri" w:eastAsia="Microsoft YaHei"/>
           <w:sz w:val="22"/>
         </w:rPr>
-        <w:t>真实演练也给出了克制而重要的结果。截至 2026-06-12，使用最近 14 个交易月、每期最多 300 只大市值 A 股进行验证，获得 4,200 条快照记录，其中 12 个月具备完整未来收益标签，共 3,593 条训练样本。Gradient Boosting 虽然在候选模型中相对更好，但样本外平均 Rank IC 为 -0.046，未达到审批门槛，因此系统没有启用 ML 排序。</w:t>
+        <w:t>最终云端演练给出了克制而重要的结果。截至 2026-06-13，Google Cloud 上已存储 60 个研究截面、90,000 条记录，其中 58 个截面具备完整未来收益标签，共 86,901 条训练样本。Gradient Boosting 的样本外平均 Rank IC 约为 0.0004，但平均 Top-Bottom Spread 为 -4.41%，未达到审批门槛，因此系统没有启用 ML 排序。</w:t>
       </w:r>
     </w:p>
     <w:p>
@@ -1635,7 +1635,7 @@
           <w:rFonts w:ascii="Calibri" w:hAnsi="Calibri" w:eastAsia="Microsoft YaHei"/>
           <w:sz w:val="22"/>
         </w:rPr>
-        <w:t>同期线性 Top-20 快照回测年化收益约 14.3%，等权股票池约 29.0%，年化超额约 -14.7%，信息比率约 -1.40。这个结果说明当前因子组合在该短样本和股票池定义下没有跑赢基准。v3.4 的价值不是制造“漂亮结果”，而是建立了一个能够真实发现模型无效、并阻止无效模型上线的研究系统。</w:t>
+        <w:t>同期线性 Top-20 快照回测覆盖 58 个持有期，年化收益约 -3.55%，等权股票池约 2.37%，年化超额约 -5.92%，信息比率约 -0.32。这个结果说明当前因子组合在更长的云端样本中仍未跑赢基准。v3.4 的价值不是制造“漂亮结果”，而是建立了一个能够真实发现模型无效、阻止无效模型上线，并可持续定时更新的研究系统。</w:t>
       </w:r>
     </w:p>
     <w:p>
@@ -5637,7 +5637,7 @@
           <w:rFonts w:ascii="Calibri" w:hAnsi="Calibri" w:eastAsia="Microsoft YaHei"/>
           <w:sz w:val="22"/>
         </w:rPr>
-        <w:t>2026-06-12 使用真实 Tushare 代理接口完成：</w:t>
+        <w:t>2026-06-12 至 2026-06-13 使用真实 Tushare 代理接口和 Google Cloud 生产资源完成：</w:t>
       </w:r>
     </w:p>
     <w:tbl>
@@ -5756,7 +5756,7 @@
                 <w:b w:val="0"/>
                 <w:sz w:val="18"/>
               </w:rPr>
-              <w:t>2025-05-30 至 2026-06-12</w:t>
+              <w:t>2021-07-30 至 2026-06-12</w:t>
             </w:r>
           </w:p>
         </w:tc>
@@ -5784,7 +5784,7 @@
                 <w:b w:val="0"/>
                 <w:sz w:val="18"/>
               </w:rPr>
-              <w:t>月末快照数</w:t>
+              <w:t>月末/最新快照数</w:t>
             </w:r>
           </w:p>
         </w:tc>
@@ -5810,7 +5810,7 @@
                 <w:b w:val="0"/>
                 <w:sz w:val="18"/>
               </w:rPr>
-              <w:t>14</w:t>
+              <w:t>60</w:t>
             </w:r>
           </w:p>
         </w:tc>
@@ -5862,7 +5862,7 @@
                 <w:b w:val="0"/>
                 <w:sz w:val="18"/>
               </w:rPr>
-              <w:t>4,200</w:t>
+              <w:t>90,000</w:t>
             </w:r>
           </w:p>
         </w:tc>
@@ -5890,7 +5890,7 @@
                 <w:b w:val="0"/>
                 <w:sz w:val="18"/>
               </w:rPr>
-              <w:t>有完整标签月份</w:t>
+              <w:t>有完整标签截面</w:t>
             </w:r>
           </w:p>
         </w:tc>
@@ -5916,7 +5916,7 @@
                 <w:b w:val="0"/>
                 <w:sz w:val="18"/>
               </w:rPr>
-              <w:t>12</w:t>
+              <w:t>58</w:t>
             </w:r>
           </w:p>
         </w:tc>
@@ -5968,7 +5968,7 @@
                 <w:b w:val="0"/>
                 <w:sz w:val="18"/>
               </w:rPr>
-              <w:t>3,593</w:t>
+              <w:t>86,901</w:t>
             </w:r>
           </w:p>
         </w:tc>
@@ -5996,7 +5996,7 @@
                 <w:b w:val="0"/>
                 <w:sz w:val="18"/>
               </w:rPr>
-              <w:t>每月最大股票数</w:t>
+              <w:t>每期最大股票数</w:t>
             </w:r>
           </w:p>
         </w:tc>
@@ -6022,7 +6022,7 @@
                 <w:b w:val="0"/>
                 <w:sz w:val="18"/>
               </w:rPr>
-              <w:t>300</w:t>
+              <w:t>1,500</w:t>
             </w:r>
           </w:p>
         </w:tc>
@@ -6265,7 +6265,7 @@
                 <w:b w:val="0"/>
                 <w:sz w:val="18"/>
               </w:rPr>
-              <w:t>-0.073</w:t>
+              <w:t>-0.0031</w:t>
             </w:r>
           </w:p>
         </w:tc>
@@ -6290,7 +6290,7 @@
                 <w:b w:val="0"/>
                 <w:sz w:val="18"/>
               </w:rPr>
-              <w:t>-0.35%</w:t>
+              <w:t>-3.71%</w:t>
             </w:r>
           </w:p>
         </w:tc>
@@ -6369,7 +6369,7 @@
                 <w:b w:val="0"/>
                 <w:sz w:val="18"/>
               </w:rPr>
-              <w:t>-0.046</w:t>
+              <w:t>0.0004</w:t>
             </w:r>
           </w:p>
         </w:tc>
@@ -6395,7 +6395,7 @@
                 <w:b w:val="0"/>
                 <w:sz w:val="18"/>
               </w:rPr>
-              <w:t>-1.94%</w:t>
+              <w:t>-4.41%</w:t>
             </w:r>
           </w:p>
         </w:tc>
@@ -6441,7 +6441,22 @@
           <w:rFonts w:ascii="Calibri" w:hAnsi="Calibri" w:eastAsia="Microsoft YaHei"/>
           <w:sz w:val="22"/>
         </w:rPr>
-        <w:t>Gradient Boosting 被选为相对较好的候选，但两个审批指标未同时为正，因此没有上线。</w:t>
+        <w:t xml:space="preserve">Gradient Boosting 被选为相对较好的候选，但平均 Top-Bottom Spread 明显为负，因此没有上线。模型版本为 </w:t>
+      </w:r>
+      <w:r>
+        <w:rPr>
+          <w:rFonts w:ascii="Consolas" w:hAnsi="Consolas" w:eastAsia="Microsoft YaHei"/>
+          <w:color w:val="16344E"/>
+          <w:sz w:val="20"/>
+        </w:rPr>
+        <w:t>mini-grp-overlay-20260430-20260612141825</w:t>
+      </w:r>
+      <w:r>
+        <w:rPr>
+          <w:rFonts w:ascii="Calibri" w:hAnsi="Calibri" w:eastAsia="Microsoft YaHei"/>
+          <w:sz w:val="22"/>
+        </w:rPr>
+        <w:t>。</w:t>
       </w:r>
     </w:p>
     <w:p>
@@ -6465,7 +6480,7 @@
           <w:rFonts w:ascii="Calibri" w:hAnsi="Calibri" w:eastAsia="Microsoft YaHei"/>
           <w:sz w:val="22"/>
         </w:rPr>
-        <w:t>12 个标签月份仍然太短。</w:t>
+        <w:t>58 个标签截面已经足以否定“当前配置立即可用”的假设，但仍不足以消除数据修订和市场制度变化风险。</w:t>
       </w:r>
     </w:p>
     <w:p>
@@ -6477,7 +6492,7 @@
           <w:rFonts w:ascii="Calibri" w:hAnsi="Calibri" w:eastAsia="Microsoft YaHei"/>
           <w:sz w:val="22"/>
         </w:rPr>
-        <w:t>当前大市值股票池和因子方向未产生稳定样本外信号。</w:t>
+        <w:t>当前大市值股票池和因子组合未产生稳定样本外信号。</w:t>
       </w:r>
     </w:p>
     <w:p>
@@ -6501,7 +6516,7 @@
           <w:rFonts w:ascii="Calibri" w:hAnsi="Calibri" w:eastAsia="Microsoft YaHei"/>
           <w:sz w:val="22"/>
         </w:rPr>
-        <w:t>模型审批机制按预期阻止了负 IC 模型进入实时选股。</w:t>
+        <w:t>模型审批机制按预期阻止了负 Spread 模型进入实时选股。</w:t>
       </w:r>
     </w:p>
     <w:p>
@@ -6569,7 +6584,7 @@
           <w:rFonts w:ascii="Calibri" w:hAnsi="Calibri" w:eastAsia="Microsoft YaHei"/>
           <w:sz w:val="22"/>
         </w:rPr>
-        <w:t>12 个持有期。</w:t>
+        <w:t>58 个持有期。</w:t>
       </w:r>
     </w:p>
     <w:tbl>
@@ -6688,7 +6703,7 @@
                 <w:b w:val="0"/>
                 <w:sz w:val="18"/>
               </w:rPr>
-              <w:t>14.31%</w:t>
+              <w:t>-3.55%</w:t>
             </w:r>
           </w:p>
         </w:tc>
@@ -6742,7 +6757,7 @@
                 <w:b w:val="0"/>
                 <w:sz w:val="18"/>
               </w:rPr>
-              <w:t>29.01%</w:t>
+              <w:t>2.37%</w:t>
             </w:r>
           </w:p>
         </w:tc>
@@ -6794,7 +6809,7 @@
                 <w:b w:val="0"/>
                 <w:sz w:val="18"/>
               </w:rPr>
-              <w:t>-14.70%</w:t>
+              <w:t>-5.92%</w:t>
             </w:r>
           </w:p>
         </w:tc>
@@ -6848,7 +6863,7 @@
                 <w:b w:val="0"/>
                 <w:sz w:val="18"/>
               </w:rPr>
-              <w:t>-5.49%</w:t>
+              <w:t>-49.32%</w:t>
             </w:r>
           </w:p>
         </w:tc>
@@ -6900,7 +6915,7 @@
                 <w:b w:val="0"/>
                 <w:sz w:val="18"/>
               </w:rPr>
-              <w:t>-1.40</w:t>
+              <w:t>-0.32</w:t>
             </w:r>
           </w:p>
         </w:tc>
@@ -6954,7 +6969,7 @@
                 <w:b w:val="0"/>
                 <w:sz w:val="18"/>
               </w:rPr>
-              <w:t>41.25%</w:t>
+              <w:t>40.69%</w:t>
             </w:r>
           </w:p>
         </w:tc>
@@ -6974,7 +6989,7 @@
           <w:rFonts w:ascii="Calibri" w:hAnsi="Calibri" w:eastAsia="Microsoft YaHei"/>
           <w:sz w:val="22"/>
         </w:rPr>
-        <w:t>绝对收益为正不能掩盖相对结果：在该样本中，Top-20 没有跑赢等权股票池。</w:t>
+        <w:t>策略期末净值约为 0.840，基准约为 1.120。无论绝对还是相对结果，当前 Top-20 都未达到可投资标准。</w:t>
       </w:r>
     </w:p>
     <w:p>
@@ -7006,7 +7021,7 @@
           <w:rFonts w:ascii="Calibri" w:hAnsi="Calibri" w:eastAsia="Microsoft YaHei"/>
           <w:sz w:val="22"/>
         </w:rPr>
-        <w:t>样本期仅约一年，市场状态单一。</w:t>
+        <w:t>样本期接近五年，但仍只覆盖有限市场制度与风格周期。</w:t>
       </w:r>
     </w:p>
     <w:p>
@@ -7907,7 +7922,7 @@
         <w:pStyle w:val="Heading2"/>
       </w:pPr>
       <w:r>
-        <w:t>9.4 当前本机安装状态</w:t>
+        <w:t>9.4 实际生产部署状态</w:t>
       </w:r>
     </w:p>
     <w:p>
@@ -7919,67 +7934,494 @@
           <w:rFonts w:ascii="Calibri" w:hAnsi="Calibri" w:eastAsia="Microsoft YaHei"/>
           <w:sz w:val="22"/>
         </w:rPr>
-        <w:t>截至报告日期：</w:t>
-      </w:r>
-    </w:p>
-    <w:p>
-      <w:pPr>
-        <w:pStyle w:val="ListBullet"/>
-      </w:pPr>
+        <w:t xml:space="preserve">截至 2026-06-13，系统已在 Google Cloud 项目 </w:t>
+      </w:r>
+      <w:r>
+        <w:rPr>
+          <w:rFonts w:ascii="Consolas" w:hAnsi="Consolas" w:eastAsia="Microsoft YaHei"/>
+          <w:color w:val="16344E"/>
+          <w:sz w:val="20"/>
+        </w:rPr>
+        <w:t>project-00980766-847f-47d3-b03</w:t>
+      </w:r>
       <w:r>
         <w:rPr>
           <w:rFonts w:ascii="Calibri" w:hAnsi="Calibri" w:eastAsia="Microsoft YaHei"/>
           <w:sz w:val="22"/>
         </w:rPr>
-        <w:t>Google Cloud SDK 572.0.0 已安装并验证。</w:t>
-      </w:r>
-    </w:p>
-    <w:p>
-      <w:pPr>
-        <w:pStyle w:val="ListBullet"/>
-      </w:pPr>
+        <w:t xml:space="preserve">、区域 </w:t>
+      </w:r>
+      <w:r>
+        <w:rPr>
+          <w:rFonts w:ascii="Consolas" w:hAnsi="Consolas" w:eastAsia="Microsoft YaHei"/>
+          <w:color w:val="16344E"/>
+          <w:sz w:val="20"/>
+        </w:rPr>
+        <w:t>asia-east1</w:t>
+      </w:r>
       <w:r>
         <w:rPr>
           <w:rFonts w:ascii="Calibri" w:hAnsi="Calibri" w:eastAsia="Microsoft YaHei"/>
           <w:sz w:val="22"/>
         </w:rPr>
-        <w:t>Docker Desktop 4.77.0 已安装。</w:t>
-      </w:r>
-    </w:p>
-    <w:p>
-      <w:pPr>
-        <w:pStyle w:val="ListBullet"/>
+        <w:t xml:space="preserve"> 完成部署：</w:t>
+      </w:r>
+    </w:p>
+    <w:tbl>
+      <w:tblPr>
+        <w:tblStyle w:val="TableGrid"/>
+        <w:tblW w:type="dxa" w:w="9360"/>
+        <w:jc w:val="center"/>
+        <w:tblLayout w:type="fixed"/>
+        <w:tblLook w:firstColumn="1" w:firstRow="1" w:lastColumn="0" w:lastRow="0" w:noHBand="0" w:noVBand="1" w:val="04A0"/>
+        <w:tblInd w:w="120" w:type="dxa"/>
+      </w:tblPr>
+      <w:tblGrid>
+        <w:gridCol w:w="2800"/>
+        <w:gridCol w:w="6560"/>
+      </w:tblGrid>
+      <w:tr>
+        <w:tc>
+          <w:tcPr>
+            <w:tcW w:type="dxa" w:w="2800"/>
+            <w:tcMar>
+              <w:top w:w="80" w:type="dxa"/>
+              <w:start w:w="120" w:type="dxa"/>
+              <w:bottom w:w="80" w:type="dxa"/>
+              <w:end w:w="120" w:type="dxa"/>
+            </w:tcMar>
+            <w:vAlign w:val="center"/>
+            <w:shd w:fill="E8EEF5"/>
+          </w:tcPr>
+          <w:p>
+            <w:pPr>
+              <w:spacing w:after="0" w:line="264" w:lineRule="auto"/>
+            </w:pPr>
+            <w:r>
+              <w:rPr>
+                <w:rFonts w:ascii="Calibri" w:hAnsi="Calibri" w:eastAsia="Microsoft YaHei"/>
+                <w:b/>
+                <w:color w:val="16344E"/>
+                <w:sz w:val="18"/>
+              </w:rPr>
+              <w:t>资源</w:t>
+            </w:r>
+          </w:p>
+        </w:tc>
+        <w:tc>
+          <w:tcPr>
+            <w:tcW w:type="dxa" w:w="6560"/>
+            <w:tcMar>
+              <w:top w:w="80" w:type="dxa"/>
+              <w:start w:w="120" w:type="dxa"/>
+              <w:bottom w:w="80" w:type="dxa"/>
+              <w:end w:w="120" w:type="dxa"/>
+            </w:tcMar>
+            <w:vAlign w:val="center"/>
+            <w:shd w:fill="E8EEF5"/>
+          </w:tcPr>
+          <w:p>
+            <w:pPr>
+              <w:spacing w:after="0" w:line="264" w:lineRule="auto"/>
+            </w:pPr>
+            <w:r>
+              <w:rPr>
+                <w:rFonts w:ascii="Calibri" w:hAnsi="Calibri" w:eastAsia="Microsoft YaHei"/>
+                <w:b/>
+                <w:color w:val="16344E"/>
+                <w:sz w:val="18"/>
+              </w:rPr>
+              <w:t>实际状态</w:t>
+            </w:r>
+          </w:p>
+        </w:tc>
+      </w:tr>
+      <w:tr>
+        <w:tc>
+          <w:tcPr>
+            <w:tcW w:type="dxa" w:w="2800"/>
+            <w:tcMar>
+              <w:top w:w="80" w:type="dxa"/>
+              <w:start w:w="120" w:type="dxa"/>
+              <w:bottom w:w="80" w:type="dxa"/>
+              <w:end w:w="120" w:type="dxa"/>
+            </w:tcMar>
+            <w:vAlign w:val="center"/>
+          </w:tcPr>
+          <w:p>
+            <w:pPr>
+              <w:spacing w:after="0" w:line="264" w:lineRule="auto"/>
+            </w:pPr>
+            <w:r>
+              <w:rPr>
+                <w:rFonts w:ascii="Calibri" w:hAnsi="Calibri" w:eastAsia="Microsoft YaHei"/>
+                <w:b w:val="0"/>
+                <w:sz w:val="18"/>
+              </w:rPr>
+              <w:t>Cloud Run Service</w:t>
+            </w:r>
+          </w:p>
+        </w:tc>
+        <w:tc>
+          <w:tcPr>
+            <w:tcW w:type="dxa" w:w="6560"/>
+            <w:tcMar>
+              <w:top w:w="80" w:type="dxa"/>
+              <w:start w:w="120" w:type="dxa"/>
+              <w:bottom w:w="80" w:type="dxa"/>
+              <w:end w:w="120" w:type="dxa"/>
+            </w:tcMar>
+            <w:vAlign w:val="center"/>
+          </w:tcPr>
+          <w:p>
+            <w:pPr>
+              <w:spacing w:after="0" w:line="264" w:lineRule="auto"/>
+            </w:pPr>
+            <w:r>
+              <w:rPr>
+                <w:rFonts w:ascii="Calibri" w:hAnsi="Calibri" w:eastAsia="Microsoft YaHei"/>
+                <w:b w:val="0"/>
+                <w:sz w:val="18"/>
+              </w:rPr>
+              <w:t>mini-grp-web，公开地址 https://mini-grp-web-l4pzrl64jq-de.a.run.app</w:t>
+            </w:r>
+          </w:p>
+        </w:tc>
+      </w:tr>
+      <w:tr>
+        <w:tc>
+          <w:tcPr>
+            <w:tcW w:type="dxa" w:w="2800"/>
+            <w:tcMar>
+              <w:top w:w="80" w:type="dxa"/>
+              <w:start w:w="120" w:type="dxa"/>
+              <w:bottom w:w="80" w:type="dxa"/>
+              <w:end w:w="120" w:type="dxa"/>
+            </w:tcMar>
+            <w:vAlign w:val="center"/>
+            <w:shd w:fill="F2F4F7"/>
+          </w:tcPr>
+          <w:p>
+            <w:pPr>
+              <w:spacing w:after="0" w:line="264" w:lineRule="auto"/>
+            </w:pPr>
+            <w:r>
+              <w:rPr>
+                <w:rFonts w:ascii="Calibri" w:hAnsi="Calibri" w:eastAsia="Microsoft YaHei"/>
+                <w:b w:val="0"/>
+                <w:sz w:val="18"/>
+              </w:rPr>
+              <w:t>Cloud Run Job</w:t>
+            </w:r>
+          </w:p>
+        </w:tc>
+        <w:tc>
+          <w:tcPr>
+            <w:tcW w:type="dxa" w:w="6560"/>
+            <w:tcMar>
+              <w:top w:w="80" w:type="dxa"/>
+              <w:start w:w="120" w:type="dxa"/>
+              <w:bottom w:w="80" w:type="dxa"/>
+              <w:end w:w="120" w:type="dxa"/>
+            </w:tcMar>
+            <w:vAlign w:val="center"/>
+            <w:shd w:fill="F2F4F7"/>
+          </w:tcPr>
+          <w:p>
+            <w:pPr>
+              <w:spacing w:after="0" w:line="264" w:lineRule="auto"/>
+            </w:pPr>
+            <w:r>
+              <w:rPr>
+                <w:rFonts w:ascii="Calibri" w:hAnsi="Calibri" w:eastAsia="Microsoft YaHei"/>
+                <w:b w:val="0"/>
+                <w:sz w:val="18"/>
+              </w:rPr>
+              <w:t>mini-grp-research，2 vCPU、4 GiB、1 小时超时</w:t>
+            </w:r>
+          </w:p>
+        </w:tc>
+      </w:tr>
+      <w:tr>
+        <w:tc>
+          <w:tcPr>
+            <w:tcW w:type="dxa" w:w="2800"/>
+            <w:tcMar>
+              <w:top w:w="80" w:type="dxa"/>
+              <w:start w:w="120" w:type="dxa"/>
+              <w:bottom w:w="80" w:type="dxa"/>
+              <w:end w:w="120" w:type="dxa"/>
+            </w:tcMar>
+            <w:vAlign w:val="center"/>
+          </w:tcPr>
+          <w:p>
+            <w:pPr>
+              <w:spacing w:after="0" w:line="264" w:lineRule="auto"/>
+            </w:pPr>
+            <w:r>
+              <w:rPr>
+                <w:rFonts w:ascii="Calibri" w:hAnsi="Calibri" w:eastAsia="Microsoft YaHei"/>
+                <w:b w:val="0"/>
+                <w:sz w:val="18"/>
+              </w:rPr>
+              <w:t>Cloud SQL</w:t>
+            </w:r>
+          </w:p>
+        </w:tc>
+        <w:tc>
+          <w:tcPr>
+            <w:tcW w:type="dxa" w:w="6560"/>
+            <w:tcMar>
+              <w:top w:w="80" w:type="dxa"/>
+              <w:start w:w="120" w:type="dxa"/>
+              <w:bottom w:w="80" w:type="dxa"/>
+              <w:end w:w="120" w:type="dxa"/>
+            </w:tcMar>
+            <w:vAlign w:val="center"/>
+          </w:tcPr>
+          <w:p>
+            <w:pPr>
+              <w:spacing w:after="0" w:line="264" w:lineRule="auto"/>
+            </w:pPr>
+            <w:r>
+              <w:rPr>
+                <w:rFonts w:ascii="Calibri" w:hAnsi="Calibri" w:eastAsia="Microsoft YaHei"/>
+                <w:b w:val="0"/>
+                <w:sz w:val="18"/>
+              </w:rPr>
+              <w:t>PostgreSQL 16，实例 mini-grp-postgres，数据库 mini_grp</w:t>
+            </w:r>
+          </w:p>
+        </w:tc>
+      </w:tr>
+      <w:tr>
+        <w:tc>
+          <w:tcPr>
+            <w:tcW w:type="dxa" w:w="2800"/>
+            <w:tcMar>
+              <w:top w:w="80" w:type="dxa"/>
+              <w:start w:w="120" w:type="dxa"/>
+              <w:bottom w:w="80" w:type="dxa"/>
+              <w:end w:w="120" w:type="dxa"/>
+            </w:tcMar>
+            <w:vAlign w:val="center"/>
+            <w:shd w:fill="F2F4F7"/>
+          </w:tcPr>
+          <w:p>
+            <w:pPr>
+              <w:spacing w:after="0" w:line="264" w:lineRule="auto"/>
+            </w:pPr>
+            <w:r>
+              <w:rPr>
+                <w:rFonts w:ascii="Calibri" w:hAnsi="Calibri" w:eastAsia="Microsoft YaHei"/>
+                <w:b w:val="0"/>
+                <w:sz w:val="18"/>
+              </w:rPr>
+              <w:t>Artifact Registry</w:t>
+            </w:r>
+          </w:p>
+        </w:tc>
+        <w:tc>
+          <w:tcPr>
+            <w:tcW w:type="dxa" w:w="6560"/>
+            <w:tcMar>
+              <w:top w:w="80" w:type="dxa"/>
+              <w:start w:w="120" w:type="dxa"/>
+              <w:bottom w:w="80" w:type="dxa"/>
+              <w:end w:w="120" w:type="dxa"/>
+            </w:tcMar>
+            <w:vAlign w:val="center"/>
+            <w:shd w:fill="F2F4F7"/>
+          </w:tcPr>
+          <w:p>
+            <w:pPr>
+              <w:spacing w:after="0" w:line="264" w:lineRule="auto"/>
+            </w:pPr>
+            <w:r>
+              <w:rPr>
+                <w:rFonts w:ascii="Calibri" w:hAnsi="Calibri" w:eastAsia="Microsoft YaHei"/>
+                <w:b w:val="0"/>
+                <w:sz w:val="18"/>
+              </w:rPr>
+              <w:t>仓库 mini-grp</w:t>
+            </w:r>
+          </w:p>
+        </w:tc>
+      </w:tr>
+      <w:tr>
+        <w:tc>
+          <w:tcPr>
+            <w:tcW w:type="dxa" w:w="2800"/>
+            <w:tcMar>
+              <w:top w:w="80" w:type="dxa"/>
+              <w:start w:w="120" w:type="dxa"/>
+              <w:bottom w:w="80" w:type="dxa"/>
+              <w:end w:w="120" w:type="dxa"/>
+            </w:tcMar>
+            <w:vAlign w:val="center"/>
+          </w:tcPr>
+          <w:p>
+            <w:pPr>
+              <w:spacing w:after="0" w:line="264" w:lineRule="auto"/>
+            </w:pPr>
+            <w:r>
+              <w:rPr>
+                <w:rFonts w:ascii="Calibri" w:hAnsi="Calibri" w:eastAsia="Microsoft YaHei"/>
+                <w:b w:val="0"/>
+                <w:sz w:val="18"/>
+              </w:rPr>
+              <w:t>Secret Manager</w:t>
+            </w:r>
+          </w:p>
+        </w:tc>
+        <w:tc>
+          <w:tcPr>
+            <w:tcW w:type="dxa" w:w="6560"/>
+            <w:tcMar>
+              <w:top w:w="80" w:type="dxa"/>
+              <w:start w:w="120" w:type="dxa"/>
+              <w:bottom w:w="80" w:type="dxa"/>
+              <w:end w:w="120" w:type="dxa"/>
+            </w:tcMar>
+            <w:vAlign w:val="center"/>
+          </w:tcPr>
+          <w:p>
+            <w:pPr>
+              <w:spacing w:after="0" w:line="264" w:lineRule="auto"/>
+            </w:pPr>
+            <w:r>
+              <w:rPr>
+                <w:rFonts w:ascii="Calibri" w:hAnsi="Calibri" w:eastAsia="Microsoft YaHei"/>
+                <w:b w:val="0"/>
+                <w:sz w:val="18"/>
+              </w:rPr>
+              <w:t>Tushare Token 与数据库 URL 分别管理</w:t>
+            </w:r>
+          </w:p>
+        </w:tc>
+      </w:tr>
+      <w:tr>
+        <w:tc>
+          <w:tcPr>
+            <w:tcW w:type="dxa" w:w="2800"/>
+            <w:tcMar>
+              <w:top w:w="80" w:type="dxa"/>
+              <w:start w:w="120" w:type="dxa"/>
+              <w:bottom w:w="80" w:type="dxa"/>
+              <w:end w:w="120" w:type="dxa"/>
+            </w:tcMar>
+            <w:vAlign w:val="center"/>
+            <w:shd w:fill="F2F4F7"/>
+          </w:tcPr>
+          <w:p>
+            <w:pPr>
+              <w:spacing w:after="0" w:line="264" w:lineRule="auto"/>
+            </w:pPr>
+            <w:r>
+              <w:rPr>
+                <w:rFonts w:ascii="Calibri" w:hAnsi="Calibri" w:eastAsia="Microsoft YaHei"/>
+                <w:b w:val="0"/>
+                <w:sz w:val="18"/>
+              </w:rPr>
+              <w:t>Runtime Service Account</w:t>
+            </w:r>
+          </w:p>
+        </w:tc>
+        <w:tc>
+          <w:tcPr>
+            <w:tcW w:type="dxa" w:w="6560"/>
+            <w:tcMar>
+              <w:top w:w="80" w:type="dxa"/>
+              <w:start w:w="120" w:type="dxa"/>
+              <w:bottom w:w="80" w:type="dxa"/>
+              <w:end w:w="120" w:type="dxa"/>
+            </w:tcMar>
+            <w:vAlign w:val="center"/>
+            <w:shd w:fill="F2F4F7"/>
+          </w:tcPr>
+          <w:p>
+            <w:pPr>
+              <w:spacing w:after="0" w:line="264" w:lineRule="auto"/>
+            </w:pPr>
+            <w:r>
+              <w:rPr>
+                <w:rFonts w:ascii="Calibri" w:hAnsi="Calibri" w:eastAsia="Microsoft YaHei"/>
+                <w:b w:val="0"/>
+                <w:sz w:val="18"/>
+              </w:rPr>
+              <w:t>mini-grp-runtime@project-00980766-847f-47d3-b03.iam.gserviceaccount.com</w:t>
+            </w:r>
+          </w:p>
+        </w:tc>
+      </w:tr>
+      <w:tr>
+        <w:tc>
+          <w:tcPr>
+            <w:tcW w:type="dxa" w:w="2800"/>
+            <w:tcMar>
+              <w:top w:w="80" w:type="dxa"/>
+              <w:start w:w="120" w:type="dxa"/>
+              <w:bottom w:w="80" w:type="dxa"/>
+              <w:end w:w="120" w:type="dxa"/>
+            </w:tcMar>
+            <w:vAlign w:val="center"/>
+          </w:tcPr>
+          <w:p>
+            <w:pPr>
+              <w:spacing w:after="0" w:line="264" w:lineRule="auto"/>
+            </w:pPr>
+            <w:r>
+              <w:rPr>
+                <w:rFonts w:ascii="Calibri" w:hAnsi="Calibri" w:eastAsia="Microsoft YaHei"/>
+                <w:b w:val="0"/>
+                <w:sz w:val="18"/>
+              </w:rPr>
+              <w:t>Cloud Scheduler</w:t>
+            </w:r>
+          </w:p>
+        </w:tc>
+        <w:tc>
+          <w:tcPr>
+            <w:tcW w:type="dxa" w:w="6560"/>
+            <w:tcMar>
+              <w:top w:w="80" w:type="dxa"/>
+              <w:start w:w="120" w:type="dxa"/>
+              <w:bottom w:w="80" w:type="dxa"/>
+              <w:end w:w="120" w:type="dxa"/>
+            </w:tcMar>
+            <w:vAlign w:val="center"/>
+          </w:tcPr>
+          <w:p>
+            <w:pPr>
+              <w:spacing w:after="0" w:line="264" w:lineRule="auto"/>
+            </w:pPr>
+            <w:r>
+              <w:rPr>
+                <w:rFonts w:ascii="Calibri" w:hAnsi="Calibri" w:eastAsia="Microsoft YaHei"/>
+                <w:b w:val="0"/>
+                <w:sz w:val="18"/>
+              </w:rPr>
+              <w:t>mini-grp-monthly，每月 1 日 20:00（Asia/Shanghai）</w:t>
+            </w:r>
+          </w:p>
+        </w:tc>
+      </w:tr>
+    </w:tbl>
+    <w:p>
+      <w:pPr>
+        <w:spacing w:after="40"/>
+      </w:pPr>
+    </w:p>
+    <w:p>
+      <w:pPr>
+        <w:jc w:val="both"/>
       </w:pPr>
       <w:r>
         <w:rPr>
           <w:rFonts w:ascii="Calibri" w:hAnsi="Calibri" w:eastAsia="Microsoft YaHei"/>
           <w:sz w:val="22"/>
         </w:rPr>
-        <w:t>WSL 2 基础组件已启用。</w:t>
-      </w:r>
-    </w:p>
-    <w:p>
-      <w:pPr>
-        <w:pStyle w:val="ListBullet"/>
-      </w:pPr>
-      <w:r>
-        <w:rPr>
-          <w:rFonts w:ascii="Calibri" w:hAnsi="Calibri" w:eastAsia="Microsoft YaHei"/>
-          <w:sz w:val="22"/>
-        </w:rPr>
-        <w:t>Windows 需要重启后 Docker 引擎才能完成首次启动。</w:t>
-      </w:r>
-    </w:p>
-    <w:p>
-      <w:pPr>
-        <w:pStyle w:val="ListBullet"/>
-      </w:pPr>
-      <w:r>
-        <w:rPr>
-          <w:rFonts w:ascii="Calibri" w:hAnsi="Calibri" w:eastAsia="Microsoft YaHei"/>
-          <w:sz w:val="22"/>
-        </w:rPr>
-        <w:t>尚需用户完成 Google 账号登录、选择项目并确认计费项目。</w:t>
+        <w:t>首次 60 截面管线在约 51 分钟内完成。采集过程中遇到过一次供应商返回空表，Cloud Run Job 自动重试后继续完成；随后代码增加了“必需响应为空时进程内重试”的保护，避免同类瞬时错误再次中断整条管线。</w:t>
       </w:r>
     </w:p>
     <w:p>
@@ -8243,7 +8685,22 @@
           <w:rFonts w:ascii="Calibri" w:hAnsi="Calibri" w:eastAsia="Microsoft YaHei"/>
           <w:sz w:val="22"/>
         </w:rPr>
-        <w:t>容器验证将在 Windows 重启、Docker 引擎启动后完成。Google Cloud 发布还需要账号和项目授权。</w:t>
+        <w:t xml:space="preserve">最终验证结果：15 项自动化测试通过；GitHub Actions 对提交 </w:t>
+      </w:r>
+      <w:r>
+        <w:rPr>
+          <w:rFonts w:ascii="Consolas" w:hAnsi="Consolas" w:eastAsia="Microsoft YaHei"/>
+          <w:color w:val="16344E"/>
+          <w:sz w:val="20"/>
+        </w:rPr>
+        <w:t>b34cb91</w:t>
+      </w:r>
+      <w:r>
+        <w:rPr>
+          <w:rFonts w:ascii="Calibri" w:hAnsi="Calibri" w:eastAsia="Microsoft YaHei"/>
+          <w:sz w:val="22"/>
+        </w:rPr>
+        <w:t xml:space="preserve"> 构建成功；Cloud Build 成功生成镜像；Cloud Run 健康检查返回成功；线上模型注册页显示 60 个截面、90,000 行和 1 个候选模型；线上回测页可完成 58 期真实快照回测。</w:t>
       </w:r>
     </w:p>
     <w:p>
@@ -8750,7 +9207,7 @@
           <w:rFonts w:ascii="Calibri" w:hAnsi="Calibri" w:eastAsia="Microsoft YaHei"/>
           <w:sz w:val="22"/>
         </w:rPr>
-        <w:t>收集至少 36-60 个有标签月份。</w:t>
+        <w:t>将现有 58 个标签截面升级为严格按财报公告日期对齐、包含退市样本的数据集。</w:t>
       </w:r>
     </w:p>
     <w:p>
@@ -9321,15 +9778,27 @@
         </w:rPr>
         <w:t>gcloud auth login</w:t>
         <w:br/>
-        <w:t>gcloud config set project YOUR_PROJECT_ID</w:t>
+        <w:t>gcloud config set project project-00980766-847f-47d3-b03</w:t>
         <w:br/>
-        <w:t>.\deploy\gcp\deploy.ps1 -ProjectId YOUR_PROJECT_ID -Region asia-east1</w:t>
+        <w:t>.\deploy\gcp\deploy.ps1 -ProjectId project-00980766-847f-47d3-b03 -Region asia-east1</w:t>
         <w:br/>
         <w:t>gcloud run jobs execute mini-grp-research --region asia-east1 --wait</w:t>
       </w:r>
     </w:p>
     <w:p>
       <w:pPr>
+        <w:jc w:val="both"/>
+      </w:pPr>
+      <w:r>
+        <w:rPr>
+          <w:rFonts w:ascii="Calibri" w:hAnsi="Calibri" w:eastAsia="Microsoft YaHei"/>
+          <w:sz w:val="22"/>
+        </w:rPr>
+        <w:t>线上地址：https://mini-grp-web-l4pzrl64jq-de.a.run.app</w:t>
+      </w:r>
+    </w:p>
+    <w:p>
+      <w:pPr>
         <w:pStyle w:val="Heading1"/>
         <w:pageBreakBefore/>
       </w:pPr>
@@ -9466,7 +9935,7 @@
           <w:rFonts w:ascii="Calibri" w:hAnsi="Calibri" w:eastAsia="Microsoft YaHei"/>
           <w:sz w:val="22"/>
         </w:rPr>
-        <w:t>真实短样本不支持启用 ML。</w:t>
+        <w:t>58 个标签截面的真实样本不支持启用 ML。</w:t>
       </w:r>
     </w:p>
     <w:p>
@@ -9490,7 +9959,7 @@
           <w:rFonts w:ascii="Calibri" w:hAnsi="Calibri" w:eastAsia="Microsoft YaHei"/>
           <w:sz w:val="22"/>
         </w:rPr>
-        <w:t>数据点时性和样本长度仍是主要限制。</w:t>
+        <w:t>数据点时性、股票池偏差和组合风险控制仍是主要限制。</w:t>
       </w:r>
     </w:p>
     <w:p>

</xml_diff>